<commit_message>
Update private documens again5
</commit_message>
<xml_diff>
--- a/Franklyn_Vasquez_CV_EN.docx
+++ b/Franklyn_Vasquez_CV_EN.docx
@@ -978,18 +978,8 @@
       <w:r>
         <w:rPr>
           <w:b/>
-          <w:color w:val="366092"/>
-          <w:sz w:val="22"/>
         </w:rPr>
-        <w:t>Daily Agenda | Android Application in Development</w:t>
-      </w:r>
-      <w:r>
-        <w:rPr>
-          <w:b/>
-          <w:color w:val="366092"/>
-          <w:sz w:val="22"/>
-        </w:rPr>
-        <w:t xml:space="preserve"> | Personal Project</w:t>
+        <w:t>Daily Agenda | Android Application | Personal Project</w:t>
       </w:r>
     </w:p>
     <w:p>
@@ -1001,12 +991,20 @@
         <w:spacing w:before="80" w:after="0"/>
       </w:pPr>
       <w:r>
-        <w:t>Developing a daily planning Android app focused on agenda organization, reminders, and task management.</w:t>
-      </w:r>
-      <w:r>
+        <w:t>Published a daily planning Android app focused on agenda organization, reminders, and task management.</w:t>
         <w:br/>
-        <w:t>Status: In progress.</w:t>
-      </w:r>
+      </w:r>
+      <w:r>
+        <w:t xml:space="preserve">Google Play: </w:t>
+      </w:r>
+      <w:hyperlink r:id="rId15">
+        <w:r>
+          <w:rPr>
+            <w:rStyle w:val="Hyperlink"/>
+          </w:rPr>
+          <w:t>https://play.google.com/store/apps/details?id=com.dailyagenda.dailyagenda</w:t>
+        </w:r>
+      </w:hyperlink>
     </w:p>
     <w:p>
       <w:pPr>

</xml_diff>

<commit_message>
Update private documens again6
</commit_message>
<xml_diff>
--- a/Franklyn_Vasquez_CV_EN.docx
+++ b/Franklyn_Vasquez_CV_EN.docx
@@ -818,6 +818,22 @@
           <w:color w:val="366092"/>
           <w:sz w:val="22"/>
         </w:rPr>
+        <w:t>RECENT</w:t>
+      </w:r>
+      <w:r>
+        <w:rPr>
+          <w:b/>
+          <w:color w:val="366092"/>
+          <w:sz w:val="22"/>
+        </w:rPr>
+        <w:t xml:space="preserve"> </w:t>
+      </w:r>
+      <w:r>
+        <w:rPr>
+          <w:b/>
+          <w:color w:val="366092"/>
+          <w:sz w:val="22"/>
+        </w:rPr>
         <w:t>PERSONAL PROJECT</w:t>
       </w:r>
     </w:p>
@@ -989,18 +1005,23 @@
           <w:numId w:val="10"/>
         </w:numPr>
         <w:spacing w:before="80" w:after="0"/>
+        <w:rPr>
+          <w:rStyle w:val="Hyperlink"/>
+          <w:color w:val="0563C1"/>
+        </w:rPr>
       </w:pPr>
       <w:r>
         <w:t>Published a daily planning Android app focused on agenda organization, reminders, and task management.</w:t>
+      </w:r>
+      <w:r>
         <w:br/>
-      </w:r>
-      <w:r>
         <w:t xml:space="preserve">Google Play: </w:t>
       </w:r>
-      <w:hyperlink r:id="rId15">
+      <w:hyperlink r:id="rId12">
         <w:r>
           <w:rPr>
             <w:rStyle w:val="Hyperlink"/>
+            <w:color w:val="0563C1"/>
           </w:rPr>
           <w:t>https://play.google.com/store/apps/details?id=com.dailyagenda.dailyagenda</w:t>
         </w:r>
@@ -1312,23 +1333,7 @@
           <w:color w:val="366092"/>
           <w:sz w:val="22"/>
         </w:rPr>
-        <w:t xml:space="preserve">PDVSA </w:t>
-      </w:r>
-      <w:r>
-        <w:rPr>
-          <w:b/>
-          <w:color w:val="366092"/>
-          <w:sz w:val="22"/>
-        </w:rPr>
-        <w:t>|</w:t>
-      </w:r>
-      <w:r>
-        <w:rPr>
-          <w:b/>
-          <w:color w:val="366092"/>
-          <w:sz w:val="22"/>
-        </w:rPr>
-        <w:t xml:space="preserve"> </w:t>
+        <w:t xml:space="preserve">PDVSA | </w:t>
       </w:r>
       <w:r>
         <w:rPr>
@@ -1842,7 +1847,7 @@
       </w:r>
     </w:p>
     <w:sectPr>
-      <w:headerReference w:type="default" r:id="rId12"/>
+      <w:headerReference w:type="default" r:id="rId13"/>
       <w:pgSz w:w="12240" w:h="15840"/>
       <w:pgMar w:top="792" w:right="1080" w:bottom="792" w:left="1080" w:header="720" w:footer="720" w:gutter="0"/>
       <w:cols w:space="720"/>
@@ -3121,6 +3126,7 @@
   <w:style w:type="character" w:default="1" w:styleId="DefaultParagraphFont">
     <w:name w:val="Default Paragraph Font"/>
     <w:uiPriority w:val="1"/>
+    <w:semiHidden/>
     <w:unhideWhenUsed/>
   </w:style>
   <w:style w:type="table" w:default="1" w:styleId="TableNormal">

</xml_diff>

<commit_message>
Update private documens again11
</commit_message>
<xml_diff>
--- a/Franklyn_Vasquez_CV_EN.docx
+++ b/Franklyn_Vasquez_CV_EN.docx
@@ -978,11 +978,6 @@
     </w:p>
     <w:p>
       <w:pPr>
-        <w:spacing w:after="0"/>
-      </w:pPr>
-    </w:p>
-    <w:p>
-      <w:pPr>
         <w:keepNext/>
         <w:spacing w:before="80" w:after="0"/>
         <w:rPr>
@@ -994,6 +989,7 @@
       <w:r>
         <w:rPr>
           <w:b/>
+          <w:color w:val="366092"/>
         </w:rPr>
         <w:t>Daily Agenda | Android Application | Personal Project</w:t>
       </w:r>
@@ -1040,17 +1036,8 @@
         <w:rPr>
           <w:b/>
           <w:color w:val="366092"/>
-          <w:sz w:val="22"/>
         </w:rPr>
-        <w:t>Key Vault | Android Application in Development</w:t>
-      </w:r>
-      <w:r>
-        <w:rPr>
-          <w:b/>
-          <w:color w:val="366092"/>
-          <w:sz w:val="22"/>
-        </w:rPr>
-        <w:t xml:space="preserve"> | Personal Project</w:t>
+        <w:t>Key Vault | Android Application | Personal Project</w:t>
       </w:r>
     </w:p>
     <w:p>
@@ -1062,12 +1049,21 @@
         <w:spacing w:before="80" w:after="0"/>
       </w:pPr>
       <w:r>
-        <w:t>Developing a secure Android app focused on storing and organizing sensitive user information.</w:t>
+        <w:t>Published an Android application focused on storing and organizing sensitive user information.</w:t>
       </w:r>
       <w:r>
         <w:br/>
-        <w:t>Status: In progress.</w:t>
-      </w:r>
+        <w:t xml:space="preserve">Google Play: </w:t>
+      </w:r>
+      <w:hyperlink r:id="rId13">
+        <w:r>
+          <w:rPr>
+            <w:rStyle w:val="Hyperlink"/>
+            <w:color w:val="0563C1"/>
+          </w:rPr>
+          <w:t>https://play.google.com/store/apps/details?id=com.keyvault.vault</w:t>
+        </w:r>
+      </w:hyperlink>
     </w:p>
     <w:p>
       <w:pPr>
@@ -1128,16 +1124,7 @@
           <w:color w:val="366092"/>
           <w:sz w:val="22"/>
         </w:rPr>
-        <w:t xml:space="preserve"> | RT </w:t>
-      </w:r>
-      <w:proofErr w:type="gramStart"/>
-      <w:r>
-        <w:rPr>
-          <w:b/>
-          <w:color w:val="366092"/>
-          <w:sz w:val="22"/>
-        </w:rPr>
-        <w:t>TECH</w:t>
+        <w:t xml:space="preserve"> | RT TECH</w:t>
       </w:r>
       <w:r>
         <w:rPr>
@@ -1154,7 +1141,6 @@
         </w:rPr>
         <w:t>—</w:t>
       </w:r>
-      <w:proofErr w:type="gramEnd"/>
       <w:r>
         <w:rPr>
           <w:i/>
@@ -1847,7 +1833,7 @@
       </w:r>
     </w:p>
     <w:sectPr>
-      <w:headerReference w:type="default" r:id="rId13"/>
+      <w:headerReference w:type="default" r:id="rId14"/>
       <w:pgSz w:w="12240" w:h="15840"/>
       <w:pgMar w:top="792" w:right="1080" w:bottom="792" w:left="1080" w:header="720" w:footer="720" w:gutter="0"/>
       <w:cols w:space="720"/>

</xml_diff>

<commit_message>
Update private documens again12
</commit_message>
<xml_diff>
--- a/Franklyn_Vasquez_CV_EN.docx
+++ b/Franklyn_Vasquez_CV_EN.docx
@@ -30,7 +30,23 @@
           <w:sz w:val="19"/>
           <w:lang w:val="fr-CA"/>
         </w:rPr>
-        <w:t>Longueuil, Québec, Canada  |  (438) 402-2044  |  vasquezfu@gmail.com</w:t>
+        <w:t xml:space="preserve">Longueuil, Québec, </w:t>
+      </w:r>
+      <w:proofErr w:type="gramStart"/>
+      <w:r>
+        <w:rPr>
+          <w:sz w:val="19"/>
+          <w:lang w:val="fr-CA"/>
+        </w:rPr>
+        <w:t>Canada  |</w:t>
+      </w:r>
+      <w:proofErr w:type="gramEnd"/>
+      <w:r>
+        <w:rPr>
+          <w:sz w:val="19"/>
+          <w:lang w:val="fr-CA"/>
+        </w:rPr>
+        <w:t xml:space="preserve"> vasquezfu@gmail.com</w:t>
       </w:r>
     </w:p>
     <w:p>
@@ -750,9 +766,11 @@
       <w:r>
         <w:t xml:space="preserve">, </w:t>
       </w:r>
+      <w:proofErr w:type="spellStart"/>
       <w:r>
         <w:t>Wazuh</w:t>
       </w:r>
+      <w:proofErr w:type="spellEnd"/>
       <w:r>
         <w:t xml:space="preserve">, </w:t>
       </w:r>
@@ -897,6 +915,7 @@
           <w:sz w:val="20"/>
         </w:rPr>
       </w:pPr>
+      <w:proofErr w:type="spellStart"/>
       <w:r>
         <w:rPr>
           <w:b/>
@@ -904,7 +923,16 @@
           <w:sz w:val="22"/>
         </w:rPr>
         <w:lastRenderedPageBreak/>
-        <w:t xml:space="preserve">FlashCards: Learn English </w:t>
+        <w:t>FlashCards</w:t>
+      </w:r>
+      <w:proofErr w:type="spellEnd"/>
+      <w:r>
+        <w:rPr>
+          <w:b/>
+          <w:color w:val="366092"/>
+          <w:sz w:val="22"/>
+        </w:rPr>
+        <w:t xml:space="preserve">: Learn English </w:t>
       </w:r>
       <w:r>
         <w:rPr>
@@ -1124,7 +1152,16 @@
           <w:color w:val="366092"/>
           <w:sz w:val="22"/>
         </w:rPr>
-        <w:t xml:space="preserve"> | RT TECH</w:t>
+        <w:t xml:space="preserve"> | RT </w:t>
+      </w:r>
+      <w:proofErr w:type="gramStart"/>
+      <w:r>
+        <w:rPr>
+          <w:b/>
+          <w:color w:val="366092"/>
+          <w:sz w:val="22"/>
+        </w:rPr>
+        <w:t>TECH</w:t>
       </w:r>
       <w:r>
         <w:rPr>
@@ -1141,6 +1178,7 @@
         </w:rPr>
         <w:t>—</w:t>
       </w:r>
+      <w:proofErr w:type="gramEnd"/>
       <w:r>
         <w:rPr>
           <w:i/>
@@ -1729,7 +1767,21 @@
         <w:rPr>
           <w:rStyle w:val="Strong"/>
         </w:rPr>
-        <w:t>CompTIA CySA+</w:t>
+        <w:t xml:space="preserve">CompTIA </w:t>
+      </w:r>
+      <w:proofErr w:type="spellStart"/>
+      <w:r>
+        <w:rPr>
+          <w:rStyle w:val="Strong"/>
+        </w:rPr>
+        <w:t>CySA</w:t>
+      </w:r>
+      <w:proofErr w:type="spellEnd"/>
+      <w:r>
+        <w:rPr>
+          <w:rStyle w:val="Strong"/>
+        </w:rPr>
+        <w:t>+</w:t>
       </w:r>
       <w:r>
         <w:t xml:space="preserve"> | Verified Credential ID: 7Q8BVEQ50FQQ1882</w:t>
@@ -1826,7 +1878,23 @@
         <w:spacing w:after="0"/>
       </w:pPr>
       <w:r>
-        <w:t xml:space="preserve">Spanish: Native  |  English: Fluent  |  French: </w:t>
+        <w:t xml:space="preserve">Spanish: </w:t>
+      </w:r>
+      <w:proofErr w:type="gramStart"/>
+      <w:r>
+        <w:t>Native  |</w:t>
+      </w:r>
+      <w:proofErr w:type="gramEnd"/>
+      <w:r>
+        <w:t xml:space="preserve">  English: </w:t>
+      </w:r>
+      <w:proofErr w:type="gramStart"/>
+      <w:r>
+        <w:t>Fluent  |</w:t>
+      </w:r>
+      <w:proofErr w:type="gramEnd"/>
+      <w:r>
+        <w:t xml:space="preserve">  French: </w:t>
       </w:r>
       <w:r>
         <w:t>Basic</w:t>

</xml_diff>